<commit_message>
feat(docx-export): keep figures atomic (image+caption) + headings with text; fill TV to 10pp
docx exporter: every figure is now a kept-together unit — the image paragraph gets
keepNext+keepLines and the caption keepLines, so an image never splits from its
caption and the figure never orphans across a page break; headings get keepNext so
they never sit alone at a page foot. Cleaner figure spacing (breathing room above,
tight to caption). Benefits every exported proposal.

Immobileyes TV expanded to a full ~10 pages (Phase I Schedule & Milestones table +
TRL/readiness paragraph). Re-exported .docx (6 figures grouped w/ captions, 6 tables)
and cost .xlsx via the system. tsc + eslint + export tests green.

Co-Authored-By: Claude Opus 4.8 <noreply@anthropic.com>
Claude-Session: https://claude.ai/code/session_014WpKLE6LTPMraFbTacbbBV
</commit_message>
<xml_diff>
--- a/docs/proposals/immobileyes-cuas/Immobileyes_DON26BX03-NP002_Technical_Volume.docx
+++ b/docs/proposals/immobileyes-cuas/Immobileyes_DON26BX03-NP002_Technical_Volume.docx
@@ -5,6 +5,7 @@
     <w:p>
       <w:pPr>
         <w:pStyle w:val="Heading1"/>
+        <w:keepNext/>
       </w:pPr>
       <w:r>
         <w:rPr>
@@ -44,6 +45,7 @@
     <w:p>
       <w:pPr>
         <w:pStyle w:val="Heading2"/>
+        <w:keepNext/>
       </w:pPr>
       <w:r>
         <w:rPr>
@@ -74,7 +76,7 @@
       <w:pPr>
         <w:keepNext/>
         <w:keepLines/>
-        <w:spacing w:after="40" w:before="60"/>
+        <w:spacing w:after="20" w:before="140"/>
         <w:jc w:val="center"/>
       </w:pPr>
       <w:r>
@@ -122,7 +124,7 @@
       <w:pPr>
         <w:keepNext/>
         <w:keepLines/>
-        <w:spacing w:after="80"/>
+        <w:spacing w:after="150"/>
         <w:jc w:val="center"/>
       </w:pPr>
       <w:r>
@@ -168,6 +170,7 @@
     <w:p>
       <w:pPr>
         <w:pStyle w:val="Heading2"/>
+        <w:keepNext/>
       </w:pPr>
       <w:r>
         <w:rPr>
@@ -232,7 +235,7 @@
       <w:pPr>
         <w:keepNext/>
         <w:keepLines/>
-        <w:spacing w:after="40" w:before="60"/>
+        <w:spacing w:after="20" w:before="140"/>
         <w:jc w:val="center"/>
       </w:pPr>
       <w:r>
@@ -280,7 +283,7 @@
       <w:pPr>
         <w:keepNext/>
         <w:keepLines/>
-        <w:spacing w:after="80"/>
+        <w:spacing w:after="150"/>
         <w:jc w:val="center"/>
       </w:pPr>
       <w:r>
@@ -298,6 +301,7 @@
     <w:p>
       <w:pPr>
         <w:pStyle w:val="Heading2"/>
+        <w:keepNext/>
       </w:pPr>
       <w:r>
         <w:rPr>
@@ -328,7 +332,7 @@
       <w:pPr>
         <w:keepNext/>
         <w:keepLines/>
-        <w:spacing w:after="40" w:before="60"/>
+        <w:spacing w:after="20" w:before="140"/>
         <w:jc w:val="center"/>
       </w:pPr>
       <w:r>
@@ -376,7 +380,7 @@
       <w:pPr>
         <w:keepNext/>
         <w:keepLines/>
-        <w:spacing w:after="80"/>
+        <w:spacing w:after="150"/>
         <w:jc w:val="center"/>
       </w:pPr>
       <w:r>
@@ -408,6 +412,7 @@
     <w:p>
       <w:pPr>
         <w:pStyle w:val="Heading2"/>
+        <w:keepNext/>
       </w:pPr>
       <w:r>
         <w:rPr>
@@ -451,6 +456,7 @@
     <w:p>
       <w:pPr>
         <w:pStyle w:val="Heading2"/>
+        <w:keepNext/>
       </w:pPr>
       <w:r>
         <w:rPr>
@@ -803,6 +809,7 @@
     <w:p>
       <w:pPr>
         <w:pStyle w:val="Heading1"/>
+        <w:keepNext/>
       </w:pPr>
       <w:r>
         <w:rPr>
@@ -900,6 +907,7 @@
     <w:p>
       <w:pPr>
         <w:pStyle w:val="Heading2"/>
+        <w:keepNext/>
       </w:pPr>
       <w:r>
         <w:rPr>
@@ -1295,6 +1303,7 @@
     <w:p>
       <w:pPr>
         <w:pStyle w:val="Heading2"/>
+        <w:keepNext/>
       </w:pPr>
       <w:r>
         <w:rPr>
@@ -1409,6 +1418,7 @@
     <w:p>
       <w:pPr>
         <w:pStyle w:val="Heading1"/>
+        <w:keepNext/>
       </w:pPr>
       <w:r>
         <w:rPr>
@@ -1984,6 +1994,7 @@
     <w:p>
       <w:pPr>
         <w:pStyle w:val="Heading2"/>
+        <w:keepNext/>
       </w:pPr>
       <w:r>
         <w:rPr>
@@ -2055,6 +2066,7 @@
     <w:p>
       <w:pPr>
         <w:pStyle w:val="Heading2"/>
+        <w:keepNext/>
       </w:pPr>
       <w:r>
         <w:rPr>
@@ -2098,6 +2110,7 @@
     <w:p>
       <w:pPr>
         <w:pStyle w:val="Heading2"/>
+        <w:keepNext/>
       </w:pPr>
       <w:r>
         <w:rPr>
@@ -2332,7 +2345,558 @@
     </w:tbl>
     <w:p>
       <w:pPr>
+        <w:pStyle w:val="Heading2"/>
+        <w:keepNext/>
+      </w:pPr>
+      <w:r>
+        <w:rPr>
+          <w:rFonts w:ascii="Times New Roman" w:cs="Times New Roman" w:eastAsia="Times New Roman" w:hAnsi="Times New Roman"/>
+          <w:b/>
+          <w:bCs/>
+          <w:sz w:val="22"/>
+          <w:szCs w:val="22"/>
+        </w:rPr>
+        <w:t xml:space="preserve">Phase I Schedule &amp; Milestones</w:t>
+      </w:r>
+    </w:p>
+    <w:tbl>
+      <w:tblPr>
+        <w:tblW w:type="pct" w:w="100%"/>
+        <w:tblBorders>
+          <w:top w:val="single" w:color="auto" w:sz="4"/>
+          <w:left w:val="single" w:color="auto" w:sz="4"/>
+          <w:bottom w:val="single" w:color="auto" w:sz="4"/>
+          <w:right w:val="single" w:color="auto" w:sz="4"/>
+          <w:insideH w:val="single" w:color="auto" w:sz="4"/>
+          <w:insideV w:val="single" w:color="auto" w:sz="4"/>
+        </w:tblBorders>
+      </w:tblPr>
+      <w:tblGrid>
+        <w:gridCol w:w="100"/>
+        <w:gridCol w:w="100"/>
+        <w:gridCol w:w="100"/>
+      </w:tblGrid>
+      <w:tr>
+        <w:trPr>
+          <w:cantSplit/>
+        </w:trPr>
+        <w:tc>
+          <w:tcPr>
+            <w:tcW w:type="pct" w:w="33.333333333333336%"/>
+            <w:shd w:color="D9E1F2" w:val="solid"/>
+          </w:tcPr>
+          <w:p>
+            <w:pPr>
+              <w:jc w:val="center"/>
+            </w:pPr>
+            <w:r>
+              <w:rPr>
+                <w:rFonts w:ascii="Times New Roman" w:cs="Times New Roman" w:eastAsia="Times New Roman" w:hAnsi="Times New Roman"/>
+                <w:b/>
+                <w:bCs/>
+                <w:sz w:val="22"/>
+                <w:szCs w:val="22"/>
+              </w:rPr>
+              <w:t xml:space="preserve">Milestone / Deliverable</w:t>
+            </w:r>
+          </w:p>
+        </w:tc>
+        <w:tc>
+          <w:tcPr>
+            <w:tcW w:type="pct" w:w="33.333333333333336%"/>
+            <w:shd w:color="D9E1F2" w:val="solid"/>
+          </w:tcPr>
+          <w:p>
+            <w:pPr>
+              <w:jc w:val="center"/>
+            </w:pPr>
+            <w:r>
+              <w:rPr>
+                <w:rFonts w:ascii="Times New Roman" w:cs="Times New Roman" w:eastAsia="Times New Roman" w:hAnsi="Times New Roman"/>
+                <w:b/>
+                <w:bCs/>
+                <w:sz w:val="22"/>
+                <w:szCs w:val="22"/>
+              </w:rPr>
+              <w:t xml:space="preserve">Month</w:t>
+            </w:r>
+          </w:p>
+        </w:tc>
+        <w:tc>
+          <w:tcPr>
+            <w:tcW w:type="pct" w:w="33.333333333333336%"/>
+            <w:shd w:color="D9E1F2" w:val="solid"/>
+          </w:tcPr>
+          <w:p>
+            <w:pPr>
+              <w:jc w:val="center"/>
+            </w:pPr>
+            <w:r>
+              <w:rPr>
+                <w:rFonts w:ascii="Times New Roman" w:cs="Times New Roman" w:eastAsia="Times New Roman" w:hAnsi="Times New Roman"/>
+                <w:b/>
+                <w:bCs/>
+                <w:sz w:val="22"/>
+                <w:szCs w:val="22"/>
+              </w:rPr>
+              <w:t xml:space="preserve">Task</w:t>
+            </w:r>
+          </w:p>
+        </w:tc>
+      </w:tr>
+      <w:tr>
+        <w:trPr>
+          <w:cantSplit/>
+        </w:trPr>
+        <w:tc>
+          <w:p>
+            <w:pPr>
+              <w:jc w:val="left"/>
+            </w:pPr>
+            <w:r>
+              <w:rPr>
+                <w:rFonts w:ascii="Times New Roman" w:cs="Times New Roman" w:eastAsia="Times New Roman" w:hAnsi="Times New Roman"/>
+                <w:b w:val="false"/>
+                <w:bCs w:val="false"/>
+                <w:sz w:val="22"/>
+                <w:szCs w:val="22"/>
+              </w:rPr>
+              <w:t xml:space="preserve">Kick-Off Briefing</w:t>
+            </w:r>
+          </w:p>
+        </w:tc>
+        <w:tc>
+          <w:p>
+            <w:pPr>
+              <w:jc w:val="left"/>
+            </w:pPr>
+            <w:r>
+              <w:rPr>
+                <w:rFonts w:ascii="Times New Roman" w:cs="Times New Roman" w:eastAsia="Times New Roman" w:hAnsi="Times New Roman"/>
+                <w:b w:val="false"/>
+                <w:bCs w:val="false"/>
+                <w:sz w:val="22"/>
+                <w:szCs w:val="22"/>
+              </w:rPr>
+              <w:t xml:space="preserve">M1</w:t>
+            </w:r>
+          </w:p>
+        </w:tc>
+        <w:tc>
+          <w:p>
+            <w:pPr>
+              <w:jc w:val="left"/>
+            </w:pPr>
+            <w:r>
+              <w:rPr>
+                <w:rFonts w:ascii="Times New Roman" w:cs="Times New Roman" w:eastAsia="Times New Roman" w:hAnsi="Times New Roman"/>
+                <w:b w:val="false"/>
+                <w:bCs w:val="false"/>
+                <w:sz w:val="22"/>
+                <w:szCs w:val="22"/>
+              </w:rPr>
+              <w:t xml:space="preserve">Task 1</w:t>
+            </w:r>
+          </w:p>
+        </w:tc>
+      </w:tr>
+      <w:tr>
+        <w:trPr>
+          <w:cantSplit/>
+        </w:trPr>
+        <w:tc>
+          <w:p>
+            <w:pPr>
+              <w:jc w:val="left"/>
+            </w:pPr>
+            <w:r>
+              <w:rPr>
+                <w:rFonts w:ascii="Times New Roman" w:cs="Times New Roman" w:eastAsia="Times New Roman" w:hAnsi="Times New Roman"/>
+                <w:b w:val="false"/>
+                <w:bCs w:val="false"/>
+                <w:sz w:val="22"/>
+                <w:szCs w:val="22"/>
+              </w:rPr>
+              <w:t xml:space="preserve">System architecture + STORM/DEXTER interface defined</w:t>
+            </w:r>
+          </w:p>
+        </w:tc>
+        <w:tc>
+          <w:p>
+            <w:pPr>
+              <w:jc w:val="left"/>
+            </w:pPr>
+            <w:r>
+              <w:rPr>
+                <w:rFonts w:ascii="Times New Roman" w:cs="Times New Roman" w:eastAsia="Times New Roman" w:hAnsi="Times New Roman"/>
+                <w:b w:val="false"/>
+                <w:bCs w:val="false"/>
+                <w:sz w:val="22"/>
+                <w:szCs w:val="22"/>
+              </w:rPr>
+              <w:t xml:space="preserve">M3</w:t>
+            </w:r>
+          </w:p>
+        </w:tc>
+        <w:tc>
+          <w:p>
+            <w:pPr>
+              <w:jc w:val="left"/>
+            </w:pPr>
+            <w:r>
+              <w:rPr>
+                <w:rFonts w:ascii="Times New Roman" w:cs="Times New Roman" w:eastAsia="Times New Roman" w:hAnsi="Times New Roman"/>
+                <w:b w:val="false"/>
+                <w:bCs w:val="false"/>
+                <w:sz w:val="22"/>
+                <w:szCs w:val="22"/>
+              </w:rPr>
+              <w:t xml:space="preserve">Task 2</w:t>
+            </w:r>
+          </w:p>
+        </w:tc>
+      </w:tr>
+      <w:tr>
+        <w:trPr>
+          <w:cantSplit/>
+        </w:trPr>
+        <w:tc>
+          <w:p>
+            <w:pPr>
+              <w:jc w:val="left"/>
+            </w:pPr>
+            <w:r>
+              <w:rPr>
+                <w:rFonts w:ascii="Times New Roman" w:cs="Times New Roman" w:eastAsia="Times New Roman" w:hAnsi="Times New Roman"/>
+                <w:b w:val="false"/>
+                <w:bCs w:val="false"/>
+                <w:sz w:val="22"/>
+                <w:szCs w:val="22"/>
+              </w:rPr>
+              <w:t xml:space="preserve">Progress Report</w:t>
+            </w:r>
+          </w:p>
+        </w:tc>
+        <w:tc>
+          <w:p>
+            <w:pPr>
+              <w:jc w:val="left"/>
+            </w:pPr>
+            <w:r>
+              <w:rPr>
+                <w:rFonts w:ascii="Times New Roman" w:cs="Times New Roman" w:eastAsia="Times New Roman" w:hAnsi="Times New Roman"/>
+                <w:b w:val="false"/>
+                <w:bCs w:val="false"/>
+                <w:sz w:val="22"/>
+                <w:szCs w:val="22"/>
+              </w:rPr>
+              <w:t xml:space="preserve">M3</w:t>
+            </w:r>
+          </w:p>
+        </w:tc>
+        <w:tc>
+          <w:p>
+            <w:pPr>
+              <w:jc w:val="left"/>
+            </w:pPr>
+            <w:r>
+              <w:rPr>
+                <w:rFonts w:ascii="Times New Roman" w:cs="Times New Roman" w:eastAsia="Times New Roman" w:hAnsi="Times New Roman"/>
+                <w:b w:val="false"/>
+                <w:bCs w:val="false"/>
+                <w:sz w:val="22"/>
+                <w:szCs w:val="22"/>
+              </w:rPr>
+              <w:t xml:space="preserve">Task 2</w:t>
+            </w:r>
+          </w:p>
+        </w:tc>
+      </w:tr>
+      <w:tr>
+        <w:trPr>
+          <w:cantSplit/>
+        </w:trPr>
+        <w:tc>
+          <w:p>
+            <w:pPr>
+              <w:jc w:val="left"/>
+            </w:pPr>
+            <w:r>
+              <w:rPr>
+                <w:rFonts w:ascii="Times New Roman" w:cs="Times New Roman" w:eastAsia="Times New Roman" w:hAnsi="Times New Roman"/>
+                <w:b w:val="false"/>
+                <w:bCs w:val="false"/>
+                <w:sz w:val="22"/>
+                <w:szCs w:val="22"/>
+              </w:rPr>
+              <w:t xml:space="preserve">EO-camera optical-effects bench data + comparison analysis</w:t>
+            </w:r>
+          </w:p>
+        </w:tc>
+        <w:tc>
+          <w:p>
+            <w:pPr>
+              <w:jc w:val="left"/>
+            </w:pPr>
+            <w:r>
+              <w:rPr>
+                <w:rFonts w:ascii="Times New Roman" w:cs="Times New Roman" w:eastAsia="Times New Roman" w:hAnsi="Times New Roman"/>
+                <w:b w:val="false"/>
+                <w:bCs w:val="false"/>
+                <w:sz w:val="22"/>
+                <w:szCs w:val="22"/>
+              </w:rPr>
+              <w:t xml:space="preserve">M5</w:t>
+            </w:r>
+          </w:p>
+        </w:tc>
+        <w:tc>
+          <w:p>
+            <w:pPr>
+              <w:jc w:val="left"/>
+            </w:pPr>
+            <w:r>
+              <w:rPr>
+                <w:rFonts w:ascii="Times New Roman" w:cs="Times New Roman" w:eastAsia="Times New Roman" w:hAnsi="Times New Roman"/>
+                <w:b w:val="false"/>
+                <w:bCs w:val="false"/>
+                <w:sz w:val="22"/>
+                <w:szCs w:val="22"/>
+              </w:rPr>
+              <w:t xml:space="preserve">Task 3</w:t>
+            </w:r>
+          </w:p>
+        </w:tc>
+      </w:tr>
+      <w:tr>
+        <w:trPr>
+          <w:cantSplit/>
+        </w:trPr>
+        <w:tc>
+          <w:p>
+            <w:pPr>
+              <w:jc w:val="left"/>
+            </w:pPr>
+            <w:r>
+              <w:rPr>
+                <w:rFonts w:ascii="Times New Roman" w:cs="Times New Roman" w:eastAsia="Times New Roman" w:hAnsi="Times New Roman"/>
+                <w:b w:val="false"/>
+                <w:bCs w:val="false"/>
+                <w:sz w:val="22"/>
+                <w:szCs w:val="22"/>
+              </w:rPr>
+              <w:t xml:space="preserve">Final Technical Report</w:t>
+            </w:r>
+          </w:p>
+        </w:tc>
+        <w:tc>
+          <w:p>
+            <w:pPr>
+              <w:jc w:val="left"/>
+            </w:pPr>
+            <w:r>
+              <w:rPr>
+                <w:rFonts w:ascii="Times New Roman" w:cs="Times New Roman" w:eastAsia="Times New Roman" w:hAnsi="Times New Roman"/>
+                <w:b w:val="false"/>
+                <w:bCs w:val="false"/>
+                <w:sz w:val="22"/>
+                <w:szCs w:val="22"/>
+              </w:rPr>
+              <w:t xml:space="preserve">M6</w:t>
+            </w:r>
+          </w:p>
+        </w:tc>
+        <w:tc>
+          <w:p>
+            <w:pPr>
+              <w:jc w:val="left"/>
+            </w:pPr>
+            <w:r>
+              <w:rPr>
+                <w:rFonts w:ascii="Times New Roman" w:cs="Times New Roman" w:eastAsia="Times New Roman" w:hAnsi="Times New Roman"/>
+                <w:b w:val="false"/>
+                <w:bCs w:val="false"/>
+                <w:sz w:val="22"/>
+                <w:szCs w:val="22"/>
+              </w:rPr>
+              <w:t xml:space="preserve">Task 4</w:t>
+            </w:r>
+          </w:p>
+        </w:tc>
+      </w:tr>
+      <w:tr>
+        <w:trPr>
+          <w:cantSplit/>
+        </w:trPr>
+        <w:tc>
+          <w:p>
+            <w:pPr>
+              <w:jc w:val="left"/>
+            </w:pPr>
+            <w:r>
+              <w:rPr>
+                <w:rFonts w:ascii="Times New Roman" w:cs="Times New Roman" w:eastAsia="Times New Roman" w:hAnsi="Times New Roman"/>
+                <w:b w:val="false"/>
+                <w:bCs w:val="false"/>
+                <w:sz w:val="22"/>
+                <w:szCs w:val="22"/>
+              </w:rPr>
+              <w:t xml:space="preserve">Initial Phase II Proposal</w:t>
+            </w:r>
+          </w:p>
+        </w:tc>
+        <w:tc>
+          <w:p>
+            <w:pPr>
+              <w:jc w:val="left"/>
+            </w:pPr>
+            <w:r>
+              <w:rPr>
+                <w:rFonts w:ascii="Times New Roman" w:cs="Times New Roman" w:eastAsia="Times New Roman" w:hAnsi="Times New Roman"/>
+                <w:b w:val="false"/>
+                <w:bCs w:val="false"/>
+                <w:sz w:val="22"/>
+                <w:szCs w:val="22"/>
+              </w:rPr>
+              <w:t xml:space="preserve">M6</w:t>
+            </w:r>
+          </w:p>
+        </w:tc>
+        <w:tc>
+          <w:p>
+            <w:pPr>
+              <w:jc w:val="left"/>
+            </w:pPr>
+            <w:r>
+              <w:rPr>
+                <w:rFonts w:ascii="Times New Roman" w:cs="Times New Roman" w:eastAsia="Times New Roman" w:hAnsi="Times New Roman"/>
+                <w:b w:val="false"/>
+                <w:bCs w:val="false"/>
+                <w:sz w:val="22"/>
+                <w:szCs w:val="22"/>
+              </w:rPr>
+              <w:t xml:space="preserve">Task 4</w:t>
+            </w:r>
+          </w:p>
+        </w:tc>
+      </w:tr>
+      <w:tr>
+        <w:trPr>
+          <w:cantSplit/>
+        </w:trPr>
+        <w:tc>
+          <w:p>
+            <w:pPr>
+              <w:jc w:val="left"/>
+            </w:pPr>
+            <w:r>
+              <w:rPr>
+                <w:rFonts w:ascii="Times New Roman" w:cs="Times New Roman" w:eastAsia="Times New Roman" w:hAnsi="Times New Roman"/>
+                <w:b w:val="false"/>
+                <w:bCs w:val="false"/>
+                <w:sz w:val="22"/>
+                <w:szCs w:val="22"/>
+              </w:rPr>
+              <w:t xml:space="preserve">Breadboard optical-effects demonstration (Option)</w:t>
+            </w:r>
+          </w:p>
+        </w:tc>
+        <w:tc>
+          <w:p>
+            <w:pPr>
+              <w:jc w:val="left"/>
+            </w:pPr>
+            <w:r>
+              <w:rPr>
+                <w:rFonts w:ascii="Times New Roman" w:cs="Times New Roman" w:eastAsia="Times New Roman" w:hAnsi="Times New Roman"/>
+                <w:b w:val="false"/>
+                <w:bCs w:val="false"/>
+                <w:sz w:val="22"/>
+                <w:szCs w:val="22"/>
+              </w:rPr>
+              <w:t xml:space="preserve">M10</w:t>
+            </w:r>
+          </w:p>
+        </w:tc>
+        <w:tc>
+          <w:p>
+            <w:pPr>
+              <w:jc w:val="left"/>
+            </w:pPr>
+            <w:r>
+              <w:rPr>
+                <w:rFonts w:ascii="Times New Roman" w:cs="Times New Roman" w:eastAsia="Times New Roman" w:hAnsi="Times New Roman"/>
+                <w:b w:val="false"/>
+                <w:bCs w:val="false"/>
+                <w:sz w:val="22"/>
+                <w:szCs w:val="22"/>
+              </w:rPr>
+              <w:t xml:space="preserve">Task 5</w:t>
+            </w:r>
+          </w:p>
+        </w:tc>
+      </w:tr>
+      <w:tr>
+        <w:trPr>
+          <w:cantSplit/>
+        </w:trPr>
+        <w:tc>
+          <w:p>
+            <w:pPr>
+              <w:jc w:val="left"/>
+            </w:pPr>
+            <w:r>
+              <w:rPr>
+                <w:rFonts w:ascii="Times New Roman" w:cs="Times New Roman" w:eastAsia="Times New Roman" w:hAnsi="Times New Roman"/>
+                <w:b w:val="false"/>
+                <w:bCs w:val="false"/>
+                <w:sz w:val="22"/>
+                <w:szCs w:val="22"/>
+              </w:rPr>
+              <w:t xml:space="preserve">Phase II prototype + NAVAIR/NAVSEA transition package (Option)</w:t>
+            </w:r>
+          </w:p>
+        </w:tc>
+        <w:tc>
+          <w:p>
+            <w:pPr>
+              <w:jc w:val="left"/>
+            </w:pPr>
+            <w:r>
+              <w:rPr>
+                <w:rFonts w:ascii="Times New Roman" w:cs="Times New Roman" w:eastAsia="Times New Roman" w:hAnsi="Times New Roman"/>
+                <w:b w:val="false"/>
+                <w:bCs w:val="false"/>
+                <w:sz w:val="22"/>
+                <w:szCs w:val="22"/>
+              </w:rPr>
+              <w:t xml:space="preserve">M12</w:t>
+            </w:r>
+          </w:p>
+        </w:tc>
+        <w:tc>
+          <w:p>
+            <w:pPr>
+              <w:jc w:val="left"/>
+            </w:pPr>
+            <w:r>
+              <w:rPr>
+                <w:rFonts w:ascii="Times New Roman" w:cs="Times New Roman" w:eastAsia="Times New Roman" w:hAnsi="Times New Roman"/>
+                <w:b w:val="false"/>
+                <w:bCs w:val="false"/>
+                <w:sz w:val="22"/>
+                <w:szCs w:val="22"/>
+              </w:rPr>
+              <w:t xml:space="preserve">Task 6</w:t>
+            </w:r>
+          </w:p>
+        </w:tc>
+      </w:tr>
+    </w:tbl>
+    <w:p>
+      <w:pPr>
         <w:pStyle w:val="Heading1"/>
+        <w:keepNext/>
       </w:pPr>
       <w:r>
         <w:rPr>
@@ -2446,7 +3010,22 @@
     </w:p>
     <w:p>
       <w:pPr>
+        <w:spacing w:after="0" w:before="0"/>
+        <w:jc w:val="left"/>
+      </w:pPr>
+      <w:r>
+        <w:rPr>
+          <w:rFonts w:ascii="Times New Roman" w:cs="Times New Roman" w:eastAsia="Times New Roman" w:hAnsi="Times New Roman"/>
+          <w:sz w:val="22"/>
+          <w:szCs w:val="22"/>
+        </w:rPr>
+        <w:t xml:space="preserve">This lineage means GHOST does not start at a blank sheet: the STORM detection/tracking stack, the DEXTER liquid-crystal beam router, and the graduated-escalation engagement doctrine are already integrated and field-demonstrated at TRL 5 against Group 1–2 UAS. Phase I therefore concentrates the effort where the technical risk actually is—characterizing and quantifying the optical-perturbation effect against EO-guided fiber-optic seekers—rather than re-developing mature subsystems, which is why a 6-month feasibility effort can credibly retire the key uncertainty and hand a defined prototype baseline to Phase II.</w:t>
+      </w:r>
+    </w:p>
+    <w:p>
+      <w:pPr>
         <w:pStyle w:val="Heading1"/>
+        <w:keepNext/>
       </w:pPr>
       <w:r>
         <w:rPr>
@@ -2477,7 +3056,7 @@
       <w:pPr>
         <w:keepNext/>
         <w:keepLines/>
-        <w:spacing w:after="40" w:before="60"/>
+        <w:spacing w:after="20" w:before="140"/>
         <w:jc w:val="center"/>
       </w:pPr>
       <w:r>
@@ -2525,7 +3104,7 @@
       <w:pPr>
         <w:keepNext/>
         <w:keepLines/>
-        <w:spacing w:after="80"/>
+        <w:spacing w:after="150"/>
         <w:jc w:val="center"/>
       </w:pPr>
       <w:r>
@@ -2543,6 +3122,7 @@
     <w:p>
       <w:pPr>
         <w:pStyle w:val="Heading2"/>
+        <w:keepNext/>
       </w:pPr>
       <w:r>
         <w:rPr>
@@ -2586,6 +3166,7 @@
     <w:p>
       <w:pPr>
         <w:pStyle w:val="Heading1"/>
+        <w:keepNext/>
       </w:pPr>
       <w:r>
         <w:rPr>
@@ -3053,6 +3634,7 @@
     <w:p>
       <w:pPr>
         <w:pStyle w:val="Heading1"/>
+        <w:keepNext/>
       </w:pPr>
       <w:r>
         <w:rPr>
@@ -3082,6 +3664,7 @@
     <w:p>
       <w:pPr>
         <w:pStyle w:val="Heading2"/>
+        <w:keepNext/>
       </w:pPr>
       <w:r>
         <w:rPr>
@@ -3125,6 +3708,7 @@
     <w:p>
       <w:pPr>
         <w:pStyle w:val="Heading1"/>
+        <w:keepNext/>
       </w:pPr>
       <w:r>
         <w:rPr>
@@ -3155,7 +3739,7 @@
       <w:pPr>
         <w:keepNext/>
         <w:keepLines/>
-        <w:spacing w:after="40" w:before="60"/>
+        <w:spacing w:after="20" w:before="140"/>
         <w:jc w:val="center"/>
       </w:pPr>
       <w:r>
@@ -3203,7 +3787,7 @@
       <w:pPr>
         <w:keepNext/>
         <w:keepLines/>
-        <w:spacing w:after="80"/>
+        <w:spacing w:after="150"/>
         <w:jc w:val="center"/>
       </w:pPr>
       <w:r>
@@ -3222,7 +3806,7 @@
       <w:pPr>
         <w:keepNext/>
         <w:keepLines/>
-        <w:spacing w:after="40" w:before="60"/>
+        <w:spacing w:after="20" w:before="140"/>
         <w:jc w:val="center"/>
       </w:pPr>
       <w:r>
@@ -3270,7 +3854,7 @@
       <w:pPr>
         <w:keepNext/>
         <w:keepLines/>
-        <w:spacing w:after="80"/>
+        <w:spacing w:after="150"/>
         <w:jc w:val="center"/>
       </w:pPr>
       <w:r>

</xml_diff>